<commit_message>
feat: implement S3 storage service, user authentication flow, and workspace guards
</commit_message>
<xml_diff>
--- a/packages/docx-engine/fixtures/minimal-word-like.docx
+++ b/packages/docx-engine/fixtures/minimal-word-like.docx
@@ -24,7 +24,7 @@
         <w:fldChar w:fldCharType="end"/>
       </w:r>
     </w:p>
-    <w:bookmarkStart w:id="7e91a7f8-eec2-4a25-95f9-9636e3fb5fcc" w:name="7e91a7f8-eec2-4a25-95f9-9636e3fb5fcc"/>
+    <w:bookmarkStart w:id="4518fc82-046f-4959-8c48-4bad99682e3d" w:name="4518fc82-046f-4959-8c48-4bad99682e3d"/>
     <w:p>
       <w:pPr>
         <w:pStyle w:val="Heading1"/>
@@ -35,7 +35,7 @@
         <w:t xml:space="preserve">1 Fixture heading</w:t>
       </w:r>
     </w:p>
-    <w:bookmarkEnd w:id="7e91a7f8-eec2-4a25-95f9-9636e3fb5fcc"/>
+    <w:bookmarkEnd w:id="4518fc82-046f-4959-8c48-4bad99682e3d"/>
     <w:p>
       <w:pPr>
         <w:pStyle w:val="Normal"/>

</xml_diff>

<commit_message>
chore: update default ports for web, API, and infrastructure services to avoid conflicts
</commit_message>
<xml_diff>
--- a/packages/docx-engine/fixtures/minimal-word-like.docx
+++ b/packages/docx-engine/fixtures/minimal-word-like.docx
@@ -24,7 +24,7 @@
         <w:fldChar w:fldCharType="end"/>
       </w:r>
     </w:p>
-    <w:bookmarkStart w:id="4518fc82-046f-4959-8c48-4bad99682e3d" w:name="4518fc82-046f-4959-8c48-4bad99682e3d"/>
+    <w:bookmarkStart w:id="7fc08400-d5f6-4d84-8dfa-d54397826029" w:name="7fc08400-d5f6-4d84-8dfa-d54397826029"/>
     <w:p>
       <w:pPr>
         <w:pStyle w:val="Heading1"/>
@@ -35,7 +35,7 @@
         <w:t xml:space="preserve">1 Fixture heading</w:t>
       </w:r>
     </w:p>
-    <w:bookmarkEnd w:id="4518fc82-046f-4959-8c48-4bad99682e3d"/>
+    <w:bookmarkEnd w:id="7fc08400-d5f6-4d84-8dfa-d54397826029"/>
     <w:p>
       <w:pPr>
         <w:pStyle w:val="Normal"/>

</xml_diff>

<commit_message>
feat: expand editor capabilities with find/replace, image insertion, link management, and text formatting tools
</commit_message>
<xml_diff>
--- a/packages/docx-engine/fixtures/minimal-word-like.docx
+++ b/packages/docx-engine/fixtures/minimal-word-like.docx
@@ -24,7 +24,7 @@
         <w:fldChar w:fldCharType="end"/>
       </w:r>
     </w:p>
-    <w:bookmarkStart w:id="7fc08400-d5f6-4d84-8dfa-d54397826029" w:name="7fc08400-d5f6-4d84-8dfa-d54397826029"/>
+    <w:bookmarkStart w:id="24854dfc-7e1a-4981-8904-8cd941c04f52" w:name="24854dfc-7e1a-4981-8904-8cd941c04f52"/>
     <w:p>
       <w:pPr>
         <w:pStyle w:val="Heading1"/>
@@ -35,7 +35,7 @@
         <w:t xml:space="preserve">1 Fixture heading</w:t>
       </w:r>
     </w:p>
-    <w:bookmarkEnd w:id="7fc08400-d5f6-4d84-8dfa-d54397826029"/>
+    <w:bookmarkEnd w:id="24854dfc-7e1a-4981-8904-8cd941c04f52"/>
     <w:p>
       <w:pPr>
         <w:pStyle w:val="Normal"/>

</xml_diff>

<commit_message>
feat: integrate Collabora/LibreOffice for document editing via WOPI protocol and implement supporting analysis infrastructure
</commit_message>
<xml_diff>
--- a/packages/docx-engine/fixtures/minimal-word-like.docx
+++ b/packages/docx-engine/fixtures/minimal-word-like.docx
@@ -24,7 +24,7 @@
         <w:fldChar w:fldCharType="end"/>
       </w:r>
     </w:p>
-    <w:bookmarkStart w:id="24854dfc-7e1a-4981-8904-8cd941c04f52" w:name="24854dfc-7e1a-4981-8904-8cd941c04f52"/>
+    <w:bookmarkStart w:id="0feb1e0d-a4f1-4a67-b3ca-9888f648470a" w:name="0feb1e0d-a4f1-4a67-b3ca-9888f648470a"/>
     <w:p>
       <w:pPr>
         <w:pStyle w:val="Heading1"/>
@@ -35,7 +35,7 @@
         <w:t xml:space="preserve">1 Fixture heading</w:t>
       </w:r>
     </w:p>
-    <w:bookmarkEnd w:id="24854dfc-7e1a-4981-8904-8cd941c04f52"/>
+    <w:bookmarkEnd w:id="0feb1e0d-a4f1-4a67-b3ca-9888f648470a"/>
     <w:p>
       <w:pPr>
         <w:pStyle w:val="Normal"/>

</xml_diff>

<commit_message>
feat: implement dynamic theme synchronization and UI component hiding for LibreOffice editor integration
</commit_message>
<xml_diff>
--- a/packages/docx-engine/fixtures/minimal-word-like.docx
+++ b/packages/docx-engine/fixtures/minimal-word-like.docx
@@ -24,7 +24,7 @@
         <w:fldChar w:fldCharType="end"/>
       </w:r>
     </w:p>
-    <w:bookmarkStart w:id="0feb1e0d-a4f1-4a67-b3ca-9888f648470a" w:name="0feb1e0d-a4f1-4a67-b3ca-9888f648470a"/>
+    <w:bookmarkStart w:id="d2cb0193-286b-4bc1-b508-d12e8a05e1b7" w:name="d2cb0193-286b-4bc1-b508-d12e8a05e1b7"/>
     <w:p>
       <w:pPr>
         <w:pStyle w:val="Heading1"/>
@@ -35,7 +35,7 @@
         <w:t xml:space="preserve">1 Fixture heading</w:t>
       </w:r>
     </w:p>
-    <w:bookmarkEnd w:id="0feb1e0d-a4f1-4a67-b3ca-9888f648470a"/>
+    <w:bookmarkEnd w:id="d2cb0193-286b-4bc1-b508-d12e8a05e1b7"/>
     <w:p>
       <w:pPr>
         <w:pStyle w:val="Normal"/>

</xml_diff>